<commit_message>
QATAR and UAE Agreement Updated
</commit_message>
<xml_diff>
--- a/templates/SNSGLOBLE/QATAR/agreement.docx
+++ b/templates/SNSGLOBLE/QATAR/agreement.docx
@@ -5394,37 +5394,6 @@
                 <w:szCs w:val="20"/>
               </w:rPr>
               <w:pict w14:anchorId="66949239">
-                <v:rect id="_x0000_s1027" style="position:absolute;margin-left:196.45pt;margin-top:32.6pt;width:141.35pt;height:88.55pt;z-index:251660288;mso-position-horizontal-relative:text;mso-position-vertical-relative:text">
-                  <v:textbox>
-                    <w:txbxContent>
-                      <w:p>
-                        <w:pPr>
-                          <w:rPr>
-                            <w:lang w:val="en-IN"/>
-                          </w:rPr>
-                        </w:pPr>
-                        <w:proofErr w:type="spellStart"/>
-                        <w:r>
-                          <w:rPr>
-                            <w:lang w:val="en-IN"/>
-                          </w:rPr>
-                          <w:t>BoarderBoX</w:t>
-                        </w:r>
-                        <w:proofErr w:type="spellEnd"/>
-                      </w:p>
-                    </w:txbxContent>
-                  </v:textbox>
-                </v:rect>
-              </w:pict>
-            </w:r>
-            <w:r>
-              <w:rPr>
-                <w:bCs/>
-                <w:noProof/>
-                <w:sz w:val="20"/>
-                <w:szCs w:val="20"/>
-              </w:rPr>
-              <w:pict w14:anchorId="66949239">
                 <v:rect id="_x0000_s1026" style="position:absolute;margin-left:14.2pt;margin-top:32.6pt;width:141.35pt;height:88.55pt;z-index:251659264;mso-position-horizontal-relative:text;mso-position-vertical-relative:text">
                   <v:textbox>
                     <w:txbxContent>
@@ -5448,15 +5417,30 @@
                 </v:rect>
               </w:pict>
             </w:r>
-            <w:r>
-              <w:rPr>
-                <w:bCs/>
+          </w:p>
+        </w:tc>
+        <w:tc>
+          <w:tcPr>
+            <w:tcW w:w="3969" w:type="dxa"/>
+            <w:gridSpan w:val="3"/>
+          </w:tcPr>
+          <w:p>
+            <w:pPr>
+              <w:rPr>
+                <w:b/>
+                <w:sz w:val="20"/>
+                <w:szCs w:val="20"/>
+              </w:rPr>
+            </w:pPr>
+            <w:r>
+              <w:rPr>
+                <w:b/>
                 <w:noProof/>
                 <w:sz w:val="20"/>
                 <w:szCs w:val="20"/>
               </w:rPr>
               <w:pict w14:anchorId="174E44D0">
-                <v:rect id="_x0000_s1029" style="position:absolute;margin-left:221.7pt;margin-top:47.3pt;width:93.3pt;height:49.6pt;rotation:-151567fd;z-index:251662336;mso-position-horizontal-relative:text;mso-position-vertical-relative:text" fillcolor="#4f81bd [3204]" stroked="f">
+                <v:rect id="_x0000_s1032" style="position:absolute;margin-left:46.2pt;margin-top:47.3pt;width:93.3pt;height:49.6pt;rotation:-151567fd;z-index:251663360;mso-position-horizontal-relative:text;mso-position-vertical-relative:text" fillcolor="#4f81bd [3204]" stroked="f">
                   <v:textbox>
                     <w:txbxContent>
                       <w:p>
@@ -5469,21 +5453,37 @@
                 </v:rect>
               </w:pict>
             </w:r>
-          </w:p>
-        </w:tc>
-        <w:tc>
-          <w:tcPr>
-            <w:tcW w:w="3969" w:type="dxa"/>
-            <w:gridSpan w:val="3"/>
-          </w:tcPr>
-          <w:p>
-            <w:pPr>
-              <w:rPr>
-                <w:b/>
-                <w:sz w:val="20"/>
-                <w:szCs w:val="20"/>
-              </w:rPr>
-            </w:pPr>
+            <w:r>
+              <w:rPr>
+                <w:b/>
+                <w:noProof/>
+                <w:sz w:val="20"/>
+                <w:szCs w:val="20"/>
+              </w:rPr>
+              <w:pict w14:anchorId="66949239">
+                <v:rect id="_x0000_s1031" style="position:absolute;margin-left:20.95pt;margin-top:32.6pt;width:141.35pt;height:88.55pt;z-index:251662336;mso-position-horizontal-relative:text;mso-position-vertical-relative:text">
+                  <v:textbox>
+                    <w:txbxContent>
+                      <w:p>
+                        <w:pPr>
+                          <w:rPr>
+                            <w:lang w:val="en-IN"/>
+                          </w:rPr>
+                        </w:pPr>
+                        <w:proofErr w:type="spellStart"/>
+                        <w:r>
+                          <w:rPr>
+                            <w:lang w:val="en-IN"/>
+                          </w:rPr>
+                          <w:t>BoarderBoX</w:t>
+                        </w:r>
+                        <w:proofErr w:type="spellEnd"/>
+                      </w:p>
+                    </w:txbxContent>
+                  </v:textbox>
+                </v:rect>
+              </w:pict>
+            </w:r>
           </w:p>
         </w:tc>
         <w:tc>

</xml_diff>